<commit_message>
Update Part G note
</commit_message>
<xml_diff>
--- a/notes/day05-tool-calling/day05-part-g-tool-result-runtime-feedback.docx
+++ b/notes/day05-tool-calling/day05-part-g-tool-result-runtime-feedback.docx
@@ -11,7 +11,7 @@
         <w:rPr>
           <w:rFonts w:ascii="Arial Unicode MS" w:hAnsi="Arial Unicode MS" w:eastAsia="Arial Unicode MS"/>
         </w:rPr>
-        <w:t>Day05 Part G 学习文档 v1.0：Tool Result 回流 Runtime（Runtime Feedback Loop）</w:t>
+        <w:t>Day05 Part G 学习文档 v1.1：Tool Result 回流 Runtime（Runtime Feedback Loop）</w:t>
       </w:r>
     </w:p>
     <w:p>
@@ -4233,7 +4233,7 @@
         <w:rPr>
           <w:rFonts w:ascii="Arial Unicode MS" w:hAnsi="Arial Unicode MS" w:eastAsia="Arial Unicode MS"/>
         </w:rPr>
-        <w:t>Day06 会继续展开：</w:t>
+        <w:t>Day06 会在 Day05 Part H / Part I 之后继续展开：</w:t>
       </w:r>
     </w:p>
     <w:p>
@@ -6706,7 +6706,7 @@
         <w:rPr>
           <w:rFonts w:ascii="Arial Unicode MS" w:hAnsi="Arial Unicode MS" w:eastAsia="Arial Unicode MS"/>
         </w:rPr>
-        <w:t>Day05 Execution Engine 到 Part G 已经形成闭环：</w:t>
+        <w:t>Day05 Execution Engine 到 Part G 已经形成了单次 Tool 调用后的反馈闭环：</w:t>
       </w:r>
     </w:p>
     <w:p>
@@ -6772,7 +6772,18 @@
         <w:rPr>
           <w:rFonts w:ascii="Arial Unicode MS" w:hAnsi="Arial Unicode MS" w:eastAsia="Arial Unicode MS"/>
         </w:rPr>
-        <w:t>下一阶段进入：</w:t>
+        <w:t>但 Part G 不是 Day05 Execution Engine 的终点。</w:t>
+      </w:r>
+    </w:p>
+    <w:p>
+      <w:pPr>
+        <w:spacing w:after="120"/>
+      </w:pPr>
+      <w:r>
+        <w:rPr>
+          <w:rFonts w:ascii="Arial Unicode MS" w:hAnsi="Arial Unicode MS" w:eastAsia="Arial Unicode MS"/>
+        </w:rPr>
+        <w:t>按照 Day05 README 的学习计划，下一节应该进入：</w:t>
       </w:r>
     </w:p>
     <w:p>
@@ -6785,7 +6796,7 @@
           <w:rFonts w:ascii="Menlo" w:hAnsi="Menlo" w:eastAsia="Menlo"/>
           <w:sz w:val="17"/>
         </w:rPr>
-        <w:t>Day06：Memory System</w:t>
+        <w:t>Day05 Part H：Multi Tool Loop</w:t>
       </w:r>
     </w:p>
     <w:p>
@@ -6809,7 +6820,7 @@
           <w:rFonts w:ascii="Arial Unicode MS" w:hAnsi="Arial Unicode MS" w:eastAsia="Arial Unicode MS"/>
           <w:i/>
         </w:rPr>
-        <w:t>当 Agent 已经可以行动并观察结果后，哪些信息应该被长期记住？</w:t>
+        <w:t>Agent 如何连续调用多个 Tool，并管理完整执行轨迹？</w:t>
       </w:r>
     </w:p>
     <w:p>
@@ -6820,7 +6831,7 @@
         <w:rPr>
           <w:rFonts w:ascii="Arial Unicode MS" w:hAnsi="Arial Unicode MS" w:eastAsia="Arial Unicode MS"/>
         </w:rPr>
-        <w:t>Day06 计划：</w:t>
+        <w:t>Part H 重点：</w:t>
       </w:r>
     </w:p>
     <w:p>
@@ -6831,7 +6842,7 @@
         <w:rPr>
           <w:rFonts w:ascii="Arial Unicode MS" w:hAnsi="Arial Unicode MS" w:eastAsia="Arial Unicode MS"/>
         </w:rPr>
-        <w:t>Memory 基础模型</w:t>
+        <w:t>为什么 Agent Loop 不等于一次 Tool Call</w:t>
       </w:r>
     </w:p>
     <w:p>
@@ -6842,7 +6853,7 @@
         <w:rPr>
           <w:rFonts w:ascii="Arial Unicode MS" w:hAnsi="Arial Unicode MS" w:eastAsia="Arial Unicode MS"/>
         </w:rPr>
-        <w:t>Conversation Memory</w:t>
+        <w:t>多 Tool 调用的数据流</w:t>
       </w:r>
     </w:p>
     <w:p>
@@ -6853,7 +6864,7 @@
         <w:rPr>
           <w:rFonts w:ascii="Arial Unicode MS" w:hAnsi="Arial Unicode MS" w:eastAsia="Arial Unicode MS"/>
         </w:rPr>
-        <w:t>Semantic Memory</w:t>
+        <w:t>Tool Call Chain</w:t>
       </w:r>
     </w:p>
     <w:p>
@@ -6864,7 +6875,7 @@
         <w:rPr>
           <w:rFonts w:ascii="Arial Unicode MS" w:hAnsi="Arial Unicode MS" w:eastAsia="Arial Unicode MS"/>
         </w:rPr>
-        <w:t>Memory Retrieval</w:t>
+        <w:t>Intermediate Observation</w:t>
       </w:r>
     </w:p>
     <w:p>
@@ -6875,7 +6886,115 @@
         <w:rPr>
           <w:rFonts w:ascii="Arial Unicode MS" w:hAnsi="Arial Unicode MS" w:eastAsia="Arial Unicode MS"/>
         </w:rPr>
-        <w:t>Memory Write Policy</w:t>
+        <w:t>Stop Condition</w:t>
+      </w:r>
+    </w:p>
+    <w:p>
+      <w:pPr>
+        <w:pStyle w:val="ListNumber"/>
+      </w:pPr>
+      <w:r>
+        <w:rPr>
+          <w:rFonts w:ascii="Arial Unicode MS" w:hAnsi="Arial Unicode MS" w:eastAsia="Arial Unicode MS"/>
+        </w:rPr>
+        <w:t>防止无限循环</w:t>
+      </w:r>
+    </w:p>
+    <w:p>
+      <w:pPr>
+        <w:pStyle w:val="ListNumber"/>
+      </w:pPr>
+      <w:r>
+        <w:rPr>
+          <w:rFonts w:ascii="Arial Unicode MS" w:hAnsi="Arial Unicode MS" w:eastAsia="Arial Unicode MS"/>
+        </w:rPr>
+        <w:t>最大步数限制</w:t>
+      </w:r>
+    </w:p>
+    <w:p>
+      <w:pPr>
+        <w:pStyle w:val="ListNumber"/>
+      </w:pPr>
+      <w:r>
+        <w:rPr>
+          <w:rFonts w:ascii="Arial Unicode MS" w:hAnsi="Arial Unicode MS" w:eastAsia="Arial Unicode MS"/>
+        </w:rPr>
+        <w:t>OpenAI Agents SDK / Claude Code 的 Multi-step Execution 映射</w:t>
+      </w:r>
+    </w:p>
+    <w:p>
+      <w:pPr>
+        <w:spacing w:after="120"/>
+      </w:pPr>
+      <w:r>
+        <w:rPr>
+          <w:rFonts w:ascii="Arial Unicode MS" w:hAnsi="Arial Unicode MS" w:eastAsia="Arial Unicode MS"/>
+        </w:rPr>
+        <w:t>随后进入：</w:t>
+      </w:r>
+    </w:p>
+    <w:p>
+      <w:pPr>
+        <w:spacing w:before="80" w:after="160"/>
+        <w:ind w:left="288"/>
+      </w:pPr>
+      <w:r>
+        <w:rPr>
+          <w:rFonts w:ascii="Menlo" w:hAnsi="Menlo" w:eastAsia="Menlo"/>
+          <w:sz w:val="17"/>
+        </w:rPr>
+        <w:t>Day05 Part I：Mini Tool Runtime Implementation</w:t>
+      </w:r>
+    </w:p>
+    <w:p>
+      <w:pPr>
+        <w:spacing w:after="120"/>
+      </w:pPr>
+      <w:r>
+        <w:rPr>
+          <w:rFonts w:ascii="Arial Unicode MS" w:hAnsi="Arial Unicode MS" w:eastAsia="Arial Unicode MS"/>
+        </w:rPr>
+        <w:t>Part I 会把 Day05 前面的设计组合起来：</w:t>
+      </w:r>
+    </w:p>
+    <w:p>
+      <w:pPr>
+        <w:spacing w:before="80" w:after="160"/>
+        <w:ind w:left="288"/>
+      </w:pPr>
+      <w:r>
+        <w:rPr>
+          <w:rFonts w:ascii="Menlo" w:hAnsi="Menlo" w:eastAsia="Menlo"/>
+          <w:sz w:val="17"/>
+        </w:rPr>
+        <w:t>Runtime Loop</w:t>
+        <w:br/>
+        <w:t xml:space="preserve">  |</w:t>
+        <w:br/>
+        <w:t xml:space="preserve">  +-- Tool Registry</w:t>
+        <w:br/>
+        <w:t xml:space="preserve">  +-- Tool Schema</w:t>
+        <w:br/>
+        <w:t xml:space="preserve">  +-- Tool Executor</w:t>
+        <w:br/>
+        <w:t xml:space="preserve">  +-- Permission</w:t>
+        <w:br/>
+        <w:t xml:space="preserve">  +-- Observation</w:t>
+        <w:br/>
+        <w:t xml:space="preserve">  +-- Recovery</w:t>
+        <w:br/>
+        <w:t xml:space="preserve">  +-- Multi Tool Loop</w:t>
+      </w:r>
+    </w:p>
+    <w:p>
+      <w:pPr>
+        <w:spacing w:after="120"/>
+      </w:pPr>
+      <w:r>
+        <w:rPr>
+          <w:rFonts w:ascii="Arial Unicode MS" w:hAnsi="Arial Unicode MS" w:eastAsia="Arial Unicode MS"/>
+        </w:rPr>
+        <w:t>Day06 Memory System 仍然是后续阶段，但它应该在 Day05 Part H / Part I 完成之后再开始。</w:t>
       </w:r>
     </w:p>
     <w:p>
@@ -7905,7 +8024,7 @@
         <w:rPr>
           <w:rFonts w:ascii="Arial Unicode MS" w:hAnsi="Arial Unicode MS" w:eastAsia="Arial Unicode MS"/>
         </w:rPr>
-        <w:t>ChatGPT 分享记录：https://chatgpt.com/share/6a71a752-1480-83e8-b1f1-fd0632e17d35</w:t>
+        <w:t>ChatGPT 分享记录：https://chatgpt.com/share/6a72d681-98d0-83e8-b1d7-2cc10cfd9c54</w:t>
       </w:r>
     </w:p>
     <w:p>

</xml_diff>